<commit_message>
Number 3-4 third experiment
</commit_message>
<xml_diff>
--- a/aSoal/REPORT 3- FUNCTIONS.docx
+++ b/aSoal/REPORT 3- FUNCTIONS.docx
@@ -804,8 +804,8 @@
         <w:tblLook w:val="0000" w:noHBand="0" w:noVBand="0" w:firstColumn="0" w:lastRow="0" w:lastColumn="0" w:firstRow="0"/>
       </w:tblPr>
       <w:tblGrid>
-        <w:gridCol w:w="1792"/>
-        <w:gridCol w:w="2038"/>
+        <w:gridCol w:w="1791"/>
+        <w:gridCol w:w="2039"/>
         <w:gridCol w:w="1454"/>
         <w:gridCol w:w="2429"/>
       </w:tblGrid>
@@ -813,7 +813,7 @@
         <w:trPr/>
         <w:tc>
           <w:tcPr>
-            <w:tcW w:w="1792" w:type="dxa"/>
+            <w:tcW w:w="1791" w:type="dxa"/>
             <w:tcBorders/>
           </w:tcPr>
           <w:p>
@@ -841,7 +841,7 @@
         </w:tc>
         <w:tc>
           <w:tcPr>
-            <w:tcW w:w="2038" w:type="dxa"/>
+            <w:tcW w:w="2039" w:type="dxa"/>
             <w:tcBorders>
               <w:bottom w:val="single" w:sz="4" w:space="0" w:color="000000"/>
             </w:tcBorders>
@@ -858,15 +858,9 @@
                 <w:sz w:val="28"/>
               </w:rPr>
             </w:pPr>
-            <w:permStart w:id="1359546543" w:edGrp="everyone"/>
-            <w:r>
-              <w:rPr>
-                <w:rFonts w:ascii="宋体" w:hAnsi="宋体"/>
-                <w:sz w:val="28"/>
-              </w:rPr>
-              <w:t xml:space="preserve">               </w:t>
-            </w:r>
-            <w:permEnd w:id="1359546543"/>
+            <w:r>
+              <w:rPr/>
+            </w:r>
           </w:p>
         </w:tc>
         <w:tc>
@@ -915,15 +909,9 @@
                 <w:sz w:val="28"/>
               </w:rPr>
             </w:pPr>
-            <w:permStart w:id="1081153001" w:edGrp="everyone"/>
-            <w:r>
-              <w:rPr>
-                <w:rFonts w:ascii="宋体" w:hAnsi="宋体"/>
-                <w:sz w:val="28"/>
-              </w:rPr>
-              <w:t xml:space="preserve">                </w:t>
-            </w:r>
-            <w:permEnd w:id="1081153001"/>
+            <w:r>
+              <w:rPr/>
+            </w:r>
           </w:p>
         </w:tc>
       </w:tr>
@@ -931,7 +919,7 @@
         <w:trPr/>
         <w:tc>
           <w:tcPr>
-            <w:tcW w:w="1792" w:type="dxa"/>
+            <w:tcW w:w="1791" w:type="dxa"/>
             <w:tcBorders/>
           </w:tcPr>
           <w:p>
@@ -980,7 +968,7 @@
         </w:tc>
         <w:tc>
           <w:tcPr>
-            <w:tcW w:w="2038" w:type="dxa"/>
+            <w:tcW w:w="2039" w:type="dxa"/>
             <w:tcBorders>
               <w:top w:val="single" w:sz="4" w:space="0" w:color="000000"/>
               <w:bottom w:val="single" w:sz="4" w:space="0" w:color="000000"/>
@@ -998,15 +986,9 @@
                 <w:sz w:val="28"/>
               </w:rPr>
             </w:pPr>
-            <w:permStart w:id="1238066954" w:edGrp="everyone"/>
-            <w:r>
-              <w:rPr>
-                <w:rFonts w:ascii="宋体" w:hAnsi="宋体"/>
-                <w:sz w:val="28"/>
-              </w:rPr>
-              <w:t xml:space="preserve">             </w:t>
-            </w:r>
-            <w:permEnd w:id="1238066954"/>
+            <w:r>
+              <w:rPr/>
+            </w:r>
           </w:p>
         </w:tc>
         <w:tc>
@@ -1056,15 +1038,9 @@
                 <w:sz w:val="28"/>
               </w:rPr>
             </w:pPr>
-            <w:permStart w:id="1427588439" w:edGrp="everyone"/>
-            <w:r>
-              <w:rPr>
-                <w:rFonts w:ascii="宋体" w:hAnsi="宋体"/>
-                <w:sz w:val="28"/>
-              </w:rPr>
-              <w:t xml:space="preserve">                </w:t>
-            </w:r>
-            <w:permEnd w:id="1427588439"/>
+            <w:r>
+              <w:rPr/>
+            </w:r>
           </w:p>
         </w:tc>
       </w:tr>
@@ -2071,8 +2047,8 @@
               <w:tblLook w:val="04a0" w:noHBand="0" w:noVBand="1" w:firstColumn="1" w:lastRow="0" w:lastColumn="0" w:firstRow="1"/>
             </w:tblPr>
             <w:tblGrid>
-              <w:gridCol w:w="522"/>
-              <w:gridCol w:w="2335"/>
+              <w:gridCol w:w="521"/>
+              <w:gridCol w:w="2336"/>
               <w:gridCol w:w="1238"/>
               <w:gridCol w:w="1231"/>
               <w:gridCol w:w="1234"/>
@@ -2126,7 +2102,7 @@
               </w:trPr>
               <w:tc>
                 <w:tcPr>
-                  <w:tcW w:w="522" w:type="dxa"/>
+                  <w:tcW w:w="521" w:type="dxa"/>
                   <w:vMerge w:val="restart"/>
                   <w:tcBorders>
                     <w:top w:val="single" w:sz="4" w:space="0" w:color="000000"/>
@@ -2159,7 +2135,7 @@
               </w:tc>
               <w:tc>
                 <w:tcPr>
-                  <w:tcW w:w="2335" w:type="dxa"/>
+                  <w:tcW w:w="2336" w:type="dxa"/>
                   <w:tcBorders>
                     <w:top w:val="single" w:sz="4" w:space="0" w:color="000000"/>
                     <w:left w:val="single" w:sz="4" w:space="0" w:color="000000"/>
@@ -2351,7 +2327,7 @@
               </w:trPr>
               <w:tc>
                 <w:tcPr>
-                  <w:tcW w:w="522" w:type="dxa"/>
+                  <w:tcW w:w="521" w:type="dxa"/>
                   <w:vMerge w:val="continue"/>
                   <w:tcBorders>
                     <w:top w:val="single" w:sz="4" w:space="0" w:color="000000"/>
@@ -2381,7 +2357,7 @@
               </w:tc>
               <w:tc>
                 <w:tcPr>
-                  <w:tcW w:w="2335" w:type="dxa"/>
+                  <w:tcW w:w="2336" w:type="dxa"/>
                   <w:tcBorders>
                     <w:top w:val="single" w:sz="4" w:space="0" w:color="000000"/>
                     <w:left w:val="single" w:sz="4" w:space="0" w:color="000000"/>
@@ -2568,7 +2544,7 @@
               </w:trPr>
               <w:tc>
                 <w:tcPr>
-                  <w:tcW w:w="522" w:type="dxa"/>
+                  <w:tcW w:w="521" w:type="dxa"/>
                   <w:vMerge w:val="continue"/>
                   <w:tcBorders>
                     <w:top w:val="single" w:sz="4" w:space="0" w:color="000000"/>
@@ -2598,7 +2574,7 @@
               </w:tc>
               <w:tc>
                 <w:tcPr>
-                  <w:tcW w:w="2335" w:type="dxa"/>
+                  <w:tcW w:w="2336" w:type="dxa"/>
                   <w:tcBorders>
                     <w:top w:val="single" w:sz="4" w:space="0" w:color="000000"/>
                     <w:left w:val="single" w:sz="4" w:space="0" w:color="000000"/>
@@ -2785,7 +2761,7 @@
               </w:trPr>
               <w:tc>
                 <w:tcPr>
-                  <w:tcW w:w="522" w:type="dxa"/>
+                  <w:tcW w:w="521" w:type="dxa"/>
                   <w:vMerge w:val="continue"/>
                   <w:tcBorders>
                     <w:top w:val="single" w:sz="4" w:space="0" w:color="000000"/>
@@ -2815,7 +2791,7 @@
               </w:tc>
               <w:tc>
                 <w:tcPr>
-                  <w:tcW w:w="2335" w:type="dxa"/>
+                  <w:tcW w:w="2336" w:type="dxa"/>
                   <w:tcBorders>
                     <w:top w:val="single" w:sz="4" w:space="0" w:color="000000"/>
                     <w:left w:val="single" w:sz="4" w:space="0" w:color="000000"/>
@@ -3002,7 +2978,7 @@
               </w:trPr>
               <w:tc>
                 <w:tcPr>
-                  <w:tcW w:w="522" w:type="dxa"/>
+                  <w:tcW w:w="521" w:type="dxa"/>
                   <w:vMerge w:val="continue"/>
                   <w:tcBorders>
                     <w:top w:val="single" w:sz="4" w:space="0" w:color="000000"/>
@@ -3032,7 +3008,7 @@
               </w:tc>
               <w:tc>
                 <w:tcPr>
-                  <w:tcW w:w="2335" w:type="dxa"/>
+                  <w:tcW w:w="2336" w:type="dxa"/>
                   <w:tcBorders>
                     <w:top w:val="single" w:sz="4" w:space="0" w:color="000000"/>
                     <w:left w:val="single" w:sz="4" w:space="0" w:color="000000"/>
@@ -3219,7 +3195,7 @@
               </w:trPr>
               <w:tc>
                 <w:tcPr>
-                  <w:tcW w:w="522" w:type="dxa"/>
+                  <w:tcW w:w="521" w:type="dxa"/>
                   <w:vMerge w:val="continue"/>
                   <w:tcBorders>
                     <w:top w:val="single" w:sz="4" w:space="0" w:color="000000"/>
@@ -3249,7 +3225,7 @@
               </w:tc>
               <w:tc>
                 <w:tcPr>
-                  <w:tcW w:w="2335" w:type="dxa"/>
+                  <w:tcW w:w="2336" w:type="dxa"/>
                   <w:tcBorders>
                     <w:top w:val="single" w:sz="4" w:space="0" w:color="000000"/>
                     <w:left w:val="single" w:sz="4" w:space="0" w:color="000000"/>
@@ -3436,7 +3412,7 @@
               </w:trPr>
               <w:tc>
                 <w:tcPr>
-                  <w:tcW w:w="522" w:type="dxa"/>
+                  <w:tcW w:w="521" w:type="dxa"/>
                   <w:vMerge w:val="continue"/>
                   <w:tcBorders>
                     <w:top w:val="single" w:sz="4" w:space="0" w:color="000000"/>
@@ -3466,7 +3442,7 @@
               </w:tc>
               <w:tc>
                 <w:tcPr>
-                  <w:tcW w:w="2335" w:type="dxa"/>
+                  <w:tcW w:w="2336" w:type="dxa"/>
                   <w:tcBorders>
                     <w:top w:val="single" w:sz="4" w:space="0" w:color="000000"/>
                     <w:left w:val="single" w:sz="4" w:space="0" w:color="000000"/>
@@ -3653,7 +3629,7 @@
               </w:trPr>
               <w:tc>
                 <w:tcPr>
-                  <w:tcW w:w="522" w:type="dxa"/>
+                  <w:tcW w:w="521" w:type="dxa"/>
                   <w:vMerge w:val="continue"/>
                   <w:tcBorders>
                     <w:top w:val="single" w:sz="4" w:space="0" w:color="000000"/>
@@ -3683,7 +3659,7 @@
               </w:tc>
               <w:tc>
                 <w:tcPr>
-                  <w:tcW w:w="2335" w:type="dxa"/>
+                  <w:tcW w:w="2336" w:type="dxa"/>
                   <w:tcBorders>
                     <w:top w:val="single" w:sz="4" w:space="0" w:color="000000"/>
                     <w:left w:val="single" w:sz="4" w:space="0" w:color="000000"/>
@@ -3870,7 +3846,7 @@
               </w:trPr>
               <w:tc>
                 <w:tcPr>
-                  <w:tcW w:w="522" w:type="dxa"/>
+                  <w:tcW w:w="521" w:type="dxa"/>
                   <w:vMerge w:val="continue"/>
                   <w:tcBorders>
                     <w:top w:val="single" w:sz="4" w:space="0" w:color="000000"/>
@@ -3900,7 +3876,7 @@
               </w:tc>
               <w:tc>
                 <w:tcPr>
-                  <w:tcW w:w="2335" w:type="dxa"/>
+                  <w:tcW w:w="2336" w:type="dxa"/>
                   <w:tcBorders>
                     <w:top w:val="single" w:sz="4" w:space="0" w:color="000000"/>
                     <w:left w:val="single" w:sz="4" w:space="0" w:color="000000"/>
@@ -4087,7 +4063,7 @@
               </w:trPr>
               <w:tc>
                 <w:tcPr>
-                  <w:tcW w:w="522" w:type="dxa"/>
+                  <w:tcW w:w="521" w:type="dxa"/>
                   <w:vMerge w:val="continue"/>
                   <w:tcBorders>
                     <w:top w:val="single" w:sz="4" w:space="0" w:color="000000"/>
@@ -4117,7 +4093,7 @@
               </w:tc>
               <w:tc>
                 <w:tcPr>
-                  <w:tcW w:w="2335" w:type="dxa"/>
+                  <w:tcW w:w="2336" w:type="dxa"/>
                   <w:tcBorders>
                     <w:top w:val="single" w:sz="4" w:space="0" w:color="000000"/>
                     <w:left w:val="single" w:sz="4" w:space="0" w:color="000000"/>
@@ -4304,7 +4280,7 @@
               </w:trPr>
               <w:tc>
                 <w:tcPr>
-                  <w:tcW w:w="522" w:type="dxa"/>
+                  <w:tcW w:w="521" w:type="dxa"/>
                   <w:vMerge w:val="continue"/>
                   <w:tcBorders>
                     <w:top w:val="single" w:sz="4" w:space="0" w:color="000000"/>
@@ -4334,7 +4310,7 @@
               </w:tc>
               <w:tc>
                 <w:tcPr>
-                  <w:tcW w:w="2335" w:type="dxa"/>
+                  <w:tcW w:w="2336" w:type="dxa"/>
                   <w:tcBorders>
                     <w:top w:val="single" w:sz="4" w:space="0" w:color="000000"/>
                     <w:left w:val="single" w:sz="4" w:space="0" w:color="000000"/>
@@ -4521,7 +4497,7 @@
               </w:trPr>
               <w:tc>
                 <w:tcPr>
-                  <w:tcW w:w="522" w:type="dxa"/>
+                  <w:tcW w:w="521" w:type="dxa"/>
                   <w:vMerge w:val="continue"/>
                   <w:tcBorders>
                     <w:top w:val="single" w:sz="4" w:space="0" w:color="000000"/>
@@ -4551,7 +4527,7 @@
               </w:tc>
               <w:tc>
                 <w:tcPr>
-                  <w:tcW w:w="2335" w:type="dxa"/>
+                  <w:tcW w:w="2336" w:type="dxa"/>
                   <w:tcBorders>
                     <w:top w:val="single" w:sz="4" w:space="0" w:color="000000"/>
                     <w:left w:val="single" w:sz="4" w:space="0" w:color="000000"/>
@@ -4738,7 +4714,7 @@
               </w:trPr>
               <w:tc>
                 <w:tcPr>
-                  <w:tcW w:w="522" w:type="dxa"/>
+                  <w:tcW w:w="521" w:type="dxa"/>
                   <w:vMerge w:val="continue"/>
                   <w:tcBorders>
                     <w:top w:val="single" w:sz="4" w:space="0" w:color="000000"/>
@@ -4768,7 +4744,7 @@
               </w:tc>
               <w:tc>
                 <w:tcPr>
-                  <w:tcW w:w="2335" w:type="dxa"/>
+                  <w:tcW w:w="2336" w:type="dxa"/>
                   <w:tcBorders>
                     <w:top w:val="single" w:sz="4" w:space="0" w:color="000000"/>
                     <w:left w:val="single" w:sz="4" w:space="0" w:color="000000"/>
@@ -4955,7 +4931,7 @@
               </w:trPr>
               <w:tc>
                 <w:tcPr>
-                  <w:tcW w:w="522" w:type="dxa"/>
+                  <w:tcW w:w="521" w:type="dxa"/>
                   <w:vMerge w:val="continue"/>
                   <w:tcBorders>
                     <w:top w:val="single" w:sz="4" w:space="0" w:color="000000"/>
@@ -4985,7 +4961,7 @@
               </w:tc>
               <w:tc>
                 <w:tcPr>
-                  <w:tcW w:w="2335" w:type="dxa"/>
+                  <w:tcW w:w="2336" w:type="dxa"/>
                   <w:tcBorders>
                     <w:top w:val="single" w:sz="4" w:space="0" w:color="000000"/>
                     <w:left w:val="single" w:sz="4" w:space="0" w:color="000000"/>
@@ -5052,7 +5028,7 @@
               </w:trPr>
               <w:tc>
                 <w:tcPr>
-                  <w:tcW w:w="522" w:type="dxa"/>
+                  <w:tcW w:w="521" w:type="dxa"/>
                   <w:vMerge w:val="continue"/>
                   <w:tcBorders>
                     <w:top w:val="single" w:sz="4" w:space="0" w:color="000000"/>
@@ -5082,7 +5058,7 @@
               </w:tc>
               <w:tc>
                 <w:tcPr>
-                  <w:tcW w:w="2335" w:type="dxa"/>
+                  <w:tcW w:w="2336" w:type="dxa"/>
                   <w:tcBorders>
                     <w:top w:val="single" w:sz="4" w:space="0" w:color="000000"/>
                     <w:left w:val="single" w:sz="4" w:space="0" w:color="000000"/>
@@ -5511,6 +5487,7 @@
     <w:qFormat/>
     <w:pPr>
       <w:widowControl w:val="false"/>
+      <w:suppressAutoHyphens w:val="true"/>
       <w:bidi w:val="0"/>
       <w:spacing w:before="0" w:after="0"/>
       <w:jc w:val="both"/>

</xml_diff>